<commit_message>
Fix 13 spelling errors found across 8 exam material files
Ran aspell (pt_BR) plus manual review over all extracted text, then
fixed each confirmed typo directly in the .docx XML (word/document.xml),
preserving original formatting. Several required per-run surgery since
Word's spellcheck markup (w:proofErr) splits words across multiple XML
runs, breaking naive string search-and-replace.

Co-Authored-By: Claude Sonnet 5 <noreply@anthropic.com>
</commit_message>
<xml_diff>
--- a/cerveja/exame-julgamento/Beer-judging-exam-instructions-pt-br.docx
+++ b/cerveja/exame-julgamento/Beer-judging-exam-instructions-pt-br.docx
@@ -177,7 +177,7 @@
         <w:rPr>
           <w:rFonts w:ascii="Arial" w:hAnsi="Arial" w:cs="Arial"/>
         </w:rPr>
-        <w:t xml:space="preserve">, senação na boca </w:t>
+        <w:t xml:space="preserve">, sensação na boca </w:t>
       </w:r>
       <w:r>
         <w:rPr>
@@ -389,7 +389,7 @@
         <w:rPr>
           <w:rFonts w:ascii="Arial" w:hAnsi="Arial" w:cs="Arial"/>
         </w:rPr>
-        <w:t xml:space="preserve">Escreva com firmeza (com lapis/lapiseira/tinta escura) para facilitar a </w:t>
+        <w:t xml:space="preserve">Escreva com firmeza (com lápis/lapiseira/tinta escura) para facilitar a </w:t>
       </w:r>
       <w:r>
         <w:rPr>

</xml_diff>